<commit_message>
docs: corregir tono del brief creativo a testimonio de lectora, no autoridad de marca
La creadora habla como alguien que leyo el libro y lo recomienda, no como
vocera de IM Music. Se ajustan ambos guiones para reflejar eso.

Co-Authored-By: Claude Sonnet 5 <noreply@anthropic.com>
Claude-Session: https://claude.ai/code/session_01BGajP5s9F1aLgfyztSAp9Y
</commit_message>
<xml_diff>
--- a/docs/libro/Brief_Creativo_Video_Libro_IM_Music.docx
+++ b/docs/libro/Brief_Creativo_Video_Libro_IM_Music.docx
@@ -649,7 +649,44 @@
           <w:rFonts w:ascii="Georgia" w:hAnsi="Georgia"/>
           <w:sz w:val="22"/>
         </w:rPr>
-        <w:t xml:space="preserve"> directo, con autoridad, sin sonar a comercial de curso online. Como alguien que ya sabe del negocio y te está ahorrando el error que ellos ya cometieron.</w:t>
+        <w:t xml:space="preserve"> directo, cercano, sin sonar a comercial de curso online.</w:t>
+      </w:r>
+    </w:p>
+    <w:p>
+      <w:pPr>
+        <w:pStyle w:val="ListBullet"/>
+      </w:pPr>
+      <w:r>
+        <w:rPr>
+          <w:rFonts w:ascii="Georgia" w:hAnsi="Georgia"/>
+          <w:b/>
+          <w:color w:val="5E17EB"/>
+          <w:sz w:val="22"/>
+        </w:rPr>
+        <w:t>⚠️ Perfil de quien habla — MUY IMPORTANTE:</w:t>
+      </w:r>
+      <w:r>
+        <w:rPr>
+          <w:rFonts w:ascii="Georgia" w:hAnsi="Georgia"/>
+          <w:sz w:val="22"/>
+        </w:rPr>
+        <w:t xml:space="preserve"> la creadora habla como </w:t>
+      </w:r>
+      <w:r>
+        <w:rPr>
+          <w:rFonts w:ascii="Georgia" w:hAnsi="Georgia"/>
+          <w:b/>
+          <w:color w:val="5E17EB"/>
+          <w:sz w:val="22"/>
+        </w:rPr>
+        <w:t>alguien que leyó el libro y lo está recomendando</w:t>
+      </w:r>
+      <w:r>
+        <w:rPr>
+          <w:rFonts w:ascii="Georgia" w:hAnsi="Georgia"/>
+          <w:sz w:val="22"/>
+        </w:rPr>
+        <w:t xml:space="preserve"> — no como vocera de IM Music ni con autoridad de marca. Su identidad principal en el video es "lo leí y me pareció excelente, se los recomiendo" — un testimonio genuino de lectora, de persona a persona. Opcionalmente puede darle contexto a por qué le importa el tema (por ejemplo "trabajo con artistas" o "soy artista"), pero eso es solo contexto, no la razón por la que habla del libro — la razón es que lo leyó. Debe evitar frases tipo "nosotros en IM Music" o "es lo que usamos" — eso lo dice IM Music, no ella.</w:t>
       </w:r>
     </w:p>
     <w:p>
@@ -1010,7 +1047,28 @@
           <w:rFonts w:ascii="Georgia" w:hAnsi="Georgia"/>
           <w:sz w:val="22"/>
         </w:rPr>
-        <w:t xml:space="preserve"> hablado a cámara, directo, tono de advertencia/revelación — no de venta.</w:t>
+        <w:t xml:space="preserve"> hablado a cámara, como quien acaba de leer algo que le voló la cabeza y tiene que contarlo — no como venta.</w:t>
+      </w:r>
+    </w:p>
+    <w:p>
+      <w:pPr>
+        <w:spacing w:after="160"/>
+      </w:pPr>
+      <w:r>
+        <w:rPr>
+          <w:rFonts w:ascii="Georgia" w:hAnsi="Georgia"/>
+          <w:b/>
+          <w:color w:val="5E17EB"/>
+          <w:sz w:val="22"/>
+        </w:rPr>
+        <w:t>Quién habla:</w:t>
+      </w:r>
+      <w:r>
+        <w:rPr>
+          <w:rFonts w:ascii="Georgia" w:hAnsi="Georgia"/>
+          <w:sz w:val="22"/>
+        </w:rPr>
+        <w:t xml:space="preserve"> ella, como lectora — le pasó/vio el problema, leyó el libro, lo está recomendando.</w:t>
       </w:r>
     </w:p>
     <w:tbl>
@@ -1326,7 +1384,7 @@
                 <w:color w:val="222222"/>
                 <w:sz w:val="19"/>
               </w:rPr>
-              <w:t>Vuelve a cámara, tono cambia a más cercano</w:t>
+              <w:t>Vuelve a cámara, tono cambia a más cercano y personal</w:t>
             </w:r>
           </w:p>
         </w:tc>
@@ -1342,7 +1400,7 @@
                 <w:color w:val="222222"/>
                 <w:sz w:val="19"/>
               </w:rPr>
-              <w:t>"ESO ES LO QUE HACE ESTE LIBRO"</w:t>
+              <w:t>"POR ESO LEÍ ESTE LIBRO"</w:t>
             </w:r>
           </w:p>
         </w:tc>
@@ -1358,7 +1416,7 @@
                 <w:color w:val="222222"/>
                 <w:sz w:val="19"/>
               </w:rPr>
-              <w:t>Presenta brevemente: guía que explica derechos, contratos, regalías y marca, sin tecnicismos legales</w:t>
+              <w:t>"Yo lo leí, y por eso lo estoy recomendando: explica derechos, contratos, regalías y marca, sin tecnicismos legales."</w:t>
             </w:r>
           </w:p>
         </w:tc>
@@ -1424,7 +1482,7 @@
                 <w:color w:val="222222"/>
                 <w:sz w:val="19"/>
               </w:rPr>
-              <w:t>CTA claro: "Búscalo en el link de la bio antes de tu próximo lanzamiento, no después."</w:t>
+              <w:t>CTA claro: "Léanselo antes de su próximo lanzamiento, no después. Se los recomiendo de verdad."</w:t>
             </w:r>
           </w:p>
         </w:tc>
@@ -1505,7 +1563,7 @@
           <w:rFonts w:ascii="Georgia" w:hAnsi="Georgia"/>
           <w:sz w:val="22"/>
         </w:rPr>
-        <w:t xml:space="preserve"> recomendación directa y personal, como si le contaras a un amigo artista por qué debería comprarlo — con autoridad, sin rodeos.</w:t>
+        <w:t xml:space="preserve"> testimonio directo y personal — ella ya leyó el libro, le pareció excelente y lo recomienda. No es IM Music hablando de sí mismo, es ella hablando del libro.</w:t>
       </w:r>
     </w:p>
     <w:tbl>
@@ -1639,7 +1697,7 @@
                 <w:color w:val="222222"/>
                 <w:sz w:val="19"/>
               </w:rPr>
-              <w:t>"TE LO DIGO DIRECTO"</w:t>
+              <w:t>"LEÍ ESTE LIBRO Y ES EXCELENTE"</w:t>
             </w:r>
           </w:p>
         </w:tc>
@@ -1655,7 +1713,7 @@
                 <w:color w:val="222222"/>
                 <w:sz w:val="19"/>
               </w:rPr>
-              <w:t>"Si haces música y todavía no sabes cómo funcionan tus regalías, tus contratos o tu marca — necesitas este libro."</w:t>
+              <w:t>"Leí este libro y me pareció excelente. Se los recomiendo."</w:t>
             </w:r>
           </w:p>
         </w:tc>
@@ -1721,7 +1779,7 @@
                 <w:color w:val="222222"/>
                 <w:sz w:val="19"/>
               </w:rPr>
-              <w:t>Menciona 2-3 contenidos concretos: "10 banderas rojas antes de firmar un contrato, cómo se reparte de verdad el dinero de Spotify, y la metodología real de marca que usamos en IM Music"</w:t>
+              <w:t>"Habla de todo lo que a un artista independiente nadie le explica: derechos, contratos, cómo se reparte de verdad el dinero de Spotify, marca, hasta inteligencia artificial en la industria."</w:t>
             </w:r>
           </w:p>
         </w:tc>
@@ -1771,7 +1829,7 @@
                 <w:color w:val="222222"/>
                 <w:sz w:val="19"/>
               </w:rPr>
-              <w:t>"NO ES OTRO CURSO RECICLADO"</w:t>
+              <w:t>"SE LOS RECOMIENDO SI HACEN MÚSICA"</w:t>
             </w:r>
           </w:p>
         </w:tc>
@@ -1787,7 +1845,7 @@
                 <w:color w:val="222222"/>
                 <w:sz w:val="19"/>
               </w:rPr>
-              <w:t>"Lo escribió un sello discográfico que está operando ahora mismo. No es teoría — es lo que usamos."</w:t>
+              <w:t>"Lo escribió IM Music, un sello discográfico independiente que está operando ahora mismo. No es teoría reciclada — y por eso lo recomiendo."</w:t>
             </w:r>
           </w:p>
         </w:tc>
@@ -1853,7 +1911,7 @@
                 <w:color w:val="222222"/>
                 <w:sz w:val="19"/>
               </w:rPr>
-              <w:t>"Por menos de lo que cuesta una comida, evitas el error que le costó dinero real a otros artistas."</w:t>
+              <w:t>"Por lo que cuesta, no hay comparación con lo que te puede ahorrar."</w:t>
             </w:r>
           </w:p>
         </w:tc>
@@ -1919,7 +1977,7 @@
                 <w:color w:val="222222"/>
                 <w:sz w:val="19"/>
               </w:rPr>
-              <w:t>CTA con urgencia honesta: "Consíguelo antes de tu próximo lanzamiento."</w:t>
+              <w:t>CTA con urgencia honesta: "Consíganlo antes de su próximo lanzamiento. Se los recomiendo de verdad."</w:t>
             </w:r>
           </w:p>
         </w:tc>

</xml_diff>